<commit_message>
seeded db and test files
</commit_message>
<xml_diff>
--- a/Synopsis.docx
+++ b/Synopsis.docx
@@ -1715,15 +1715,7 @@
           <w:color w:val="0070C0"/>
           <w:lang w:val="en-IN"/>
         </w:rPr>
-        <w:t>)</w:t>
-      </w:r>
-      <w:r>
-        <w:rPr>
-          <w:rFonts w:ascii="Times New Roman" w:hAnsi="Times New Roman" w:cs="Times New Roman"/>
-          <w:color w:val="0070C0"/>
-          <w:lang w:val="en-IN"/>
-        </w:rPr>
-        <w:t>:</w:t>
+        <w:t>):</w:t>
       </w:r>
     </w:p>
     <w:p>
@@ -2781,13 +2773,7 @@
         <w:rPr>
           <w:rFonts w:ascii="Times New Roman" w:hAnsi="Times New Roman" w:cs="Times New Roman"/>
         </w:rPr>
-        <w:t>System Workflow</w:t>
-      </w:r>
-      <w:r>
-        <w:rPr>
-          <w:rFonts w:ascii="Times New Roman" w:hAnsi="Times New Roman" w:cs="Times New Roman"/>
-        </w:rPr>
-        <w:t xml:space="preserve"> (initial)</w:t>
+        <w:t>System Workflow (initial)</w:t>
       </w:r>
     </w:p>
     <w:p/>
@@ -3747,7 +3733,1714 @@
         <w:t>/Render.</w:t>
       </w:r>
     </w:p>
-    <w:p/>
+    <w:p>
+      <w:pPr>
+        <w:spacing w:after="160" w:line="259" w:lineRule="auto"/>
+      </w:pPr>
+      <w:r>
+        <w:br w:type="page"/>
+      </w:r>
+    </w:p>
+    <w:p>
+      <w:pPr>
+        <w:pStyle w:val="Heading2"/>
+      </w:pPr>
+      <w:r>
+        <w:lastRenderedPageBreak/>
+        <w:t>Database Schema</w:t>
+      </w:r>
+    </w:p>
+    <w:p>
+      <w:pPr>
+        <w:spacing w:after="160" w:line="259" w:lineRule="auto"/>
+        <w:rPr>
+          <w:rFonts w:ascii="Times New Roman" w:hAnsi="Times New Roman" w:cs="Times New Roman"/>
+          <w:b/>
+          <w:bCs/>
+          <w:lang w:val="en-IN"/>
+        </w:rPr>
+      </w:pPr>
+      <w:r>
+        <w:rPr>
+          <w:rFonts w:ascii="Times New Roman" w:hAnsi="Times New Roman" w:cs="Times New Roman"/>
+          <w:b/>
+          <w:bCs/>
+          <w:lang w:val="en-IN"/>
+        </w:rPr>
+        <w:t>Database Provider</w:t>
+      </w:r>
+    </w:p>
+    <w:p>
+      <w:pPr>
+        <w:spacing w:after="160" w:line="259" w:lineRule="auto"/>
+        <w:rPr>
+          <w:rFonts w:ascii="Times New Roman" w:hAnsi="Times New Roman" w:cs="Times New Roman"/>
+          <w:lang w:val="en-IN"/>
+        </w:rPr>
+      </w:pPr>
+      <w:proofErr w:type="spellStart"/>
+      <w:r>
+        <w:rPr>
+          <w:rFonts w:ascii="Times New Roman" w:hAnsi="Times New Roman" w:cs="Times New Roman"/>
+          <w:b/>
+          <w:bCs/>
+          <w:color w:val="0F9ED5" w:themeColor="accent4"/>
+          <w:lang w:val="en-IN"/>
+        </w:rPr>
+        <w:t>Supabase</w:t>
+      </w:r>
+      <w:proofErr w:type="spellEnd"/>
+      <w:r>
+        <w:rPr>
+          <w:rFonts w:ascii="Times New Roman" w:hAnsi="Times New Roman" w:cs="Times New Roman"/>
+          <w:b/>
+          <w:bCs/>
+          <w:color w:val="0F9ED5" w:themeColor="accent4"/>
+          <w:lang w:val="en-IN"/>
+        </w:rPr>
+        <w:t xml:space="preserve"> PostgreSQL with </w:t>
+      </w:r>
+      <w:proofErr w:type="spellStart"/>
+      <w:r>
+        <w:rPr>
+          <w:rFonts w:ascii="Times New Roman" w:hAnsi="Times New Roman" w:cs="Times New Roman"/>
+          <w:b/>
+          <w:bCs/>
+          <w:color w:val="0F9ED5" w:themeColor="accent4"/>
+          <w:lang w:val="en-IN"/>
+        </w:rPr>
+        <w:t>pgvector</w:t>
+      </w:r>
+      <w:proofErr w:type="spellEnd"/>
+      <w:r>
+        <w:rPr>
+          <w:rFonts w:ascii="Times New Roman" w:hAnsi="Times New Roman" w:cs="Times New Roman"/>
+          <w:b/>
+          <w:bCs/>
+          <w:color w:val="0F9ED5" w:themeColor="accent4"/>
+          <w:lang w:val="en-IN"/>
+        </w:rPr>
+        <w:br/>
+      </w:r>
+      <w:r>
+        <w:rPr>
+          <w:rFonts w:ascii="Times New Roman" w:hAnsi="Times New Roman" w:cs="Times New Roman"/>
+          <w:b/>
+          <w:bCs/>
+          <w:lang w:val="en-IN"/>
+        </w:rPr>
+        <w:t>Schema Name:</w:t>
+      </w:r>
+      <w:r>
+        <w:rPr>
+          <w:rFonts w:ascii="Times New Roman" w:hAnsi="Times New Roman" w:cs="Times New Roman"/>
+          <w:lang w:val="en-IN"/>
+        </w:rPr>
+        <w:t> </w:t>
+      </w:r>
+      <w:proofErr w:type="spellStart"/>
+      <w:r>
+        <w:rPr>
+          <w:rFonts w:ascii="Times New Roman" w:hAnsi="Times New Roman" w:cs="Times New Roman"/>
+          <w:lang w:val="en-IN"/>
+        </w:rPr>
+        <w:t>urbankey</w:t>
+      </w:r>
+      <w:proofErr w:type="spellEnd"/>
+    </w:p>
+    <w:p>
+      <w:pPr>
+        <w:pStyle w:val="Heading3"/>
+        <w:rPr>
+          <w:rFonts w:ascii="Times New Roman" w:hAnsi="Times New Roman" w:cs="Times New Roman"/>
+        </w:rPr>
+      </w:pPr>
+      <w:r>
+        <w:rPr>
+          <w:rFonts w:ascii="Times New Roman" w:hAnsi="Times New Roman" w:cs="Times New Roman"/>
+        </w:rPr>
+        <w:t>Core Models</w:t>
+      </w:r>
+    </w:p>
+    <w:tbl>
+      <w:tblPr>
+        <w:tblStyle w:val="PlainTable2"/>
+        <w:tblW w:w="10938" w:type="dxa"/>
+        <w:tblLook w:val="04A0" w:firstRow="1" w:lastRow="0" w:firstColumn="1" w:lastColumn="0" w:noHBand="0" w:noVBand="1"/>
+      </w:tblPr>
+      <w:tblGrid>
+        <w:gridCol w:w="2693"/>
+        <w:gridCol w:w="2731"/>
+        <w:gridCol w:w="5514"/>
+      </w:tblGrid>
+      <w:tr>
+        <w:trPr>
+          <w:cnfStyle w:val="100000000000" w:firstRow="1" w:lastRow="0" w:firstColumn="0" w:lastColumn="0" w:oddVBand="0" w:evenVBand="0" w:oddHBand="0" w:evenHBand="0" w:firstRowFirstColumn="0" w:firstRowLastColumn="0" w:lastRowFirstColumn="0" w:lastRowLastColumn="0"/>
+          <w:trHeight w:val="340"/>
+        </w:trPr>
+        <w:tc>
+          <w:tcPr>
+            <w:cnfStyle w:val="001000000000" w:firstRow="0" w:lastRow="0" w:firstColumn="1" w:lastColumn="0" w:oddVBand="0" w:evenVBand="0" w:oddHBand="0" w:evenHBand="0" w:firstRowFirstColumn="0" w:firstRowLastColumn="0" w:lastRowFirstColumn="0" w:lastRowLastColumn="0"/>
+            <w:tcW w:w="0" w:type="auto"/>
+            <w:hideMark/>
+          </w:tcPr>
+          <w:p>
+            <w:pPr>
+              <w:spacing w:after="160"/>
+              <w:rPr>
+                <w:rFonts w:ascii="Times New Roman" w:hAnsi="Times New Roman" w:cs="Times New Roman"/>
+                <w:lang w:val="en-IN"/>
+              </w:rPr>
+            </w:pPr>
+            <w:r>
+              <w:rPr>
+                <w:rFonts w:ascii="Times New Roman" w:hAnsi="Times New Roman" w:cs="Times New Roman"/>
+                <w:lang w:val="en-IN"/>
+              </w:rPr>
+              <w:t>Model</w:t>
+            </w:r>
+          </w:p>
+        </w:tc>
+        <w:tc>
+          <w:tcPr>
+            <w:tcW w:w="0" w:type="auto"/>
+            <w:hideMark/>
+          </w:tcPr>
+          <w:p>
+            <w:pPr>
+              <w:spacing w:after="160"/>
+              <w:cnfStyle w:val="100000000000" w:firstRow="1" w:lastRow="0" w:firstColumn="0" w:lastColumn="0" w:oddVBand="0" w:evenVBand="0" w:oddHBand="0" w:evenHBand="0" w:firstRowFirstColumn="0" w:firstRowLastColumn="0" w:lastRowFirstColumn="0" w:lastRowLastColumn="0"/>
+              <w:rPr>
+                <w:rFonts w:ascii="Times New Roman" w:hAnsi="Times New Roman" w:cs="Times New Roman"/>
+                <w:lang w:val="en-IN"/>
+              </w:rPr>
+            </w:pPr>
+            <w:r>
+              <w:rPr>
+                <w:rFonts w:ascii="Times New Roman" w:hAnsi="Times New Roman" w:cs="Times New Roman"/>
+                <w:lang w:val="en-IN"/>
+              </w:rPr>
+              <w:t>Description</w:t>
+            </w:r>
+          </w:p>
+        </w:tc>
+        <w:tc>
+          <w:tcPr>
+            <w:tcW w:w="0" w:type="auto"/>
+            <w:hideMark/>
+          </w:tcPr>
+          <w:p>
+            <w:pPr>
+              <w:spacing w:after="160"/>
+              <w:cnfStyle w:val="100000000000" w:firstRow="1" w:lastRow="0" w:firstColumn="0" w:lastColumn="0" w:oddVBand="0" w:evenVBand="0" w:oddHBand="0" w:evenHBand="0" w:firstRowFirstColumn="0" w:firstRowLastColumn="0" w:lastRowFirstColumn="0" w:lastRowLastColumn="0"/>
+              <w:rPr>
+                <w:rFonts w:ascii="Times New Roman" w:hAnsi="Times New Roman" w:cs="Times New Roman"/>
+                <w:lang w:val="en-IN"/>
+              </w:rPr>
+            </w:pPr>
+            <w:r>
+              <w:rPr>
+                <w:rFonts w:ascii="Times New Roman" w:hAnsi="Times New Roman" w:cs="Times New Roman"/>
+                <w:lang w:val="en-IN"/>
+              </w:rPr>
+              <w:t>Key Fields</w:t>
+            </w:r>
+          </w:p>
+        </w:tc>
+      </w:tr>
+      <w:tr>
+        <w:trPr>
+          <w:cnfStyle w:val="000000100000" w:firstRow="0" w:lastRow="0" w:firstColumn="0" w:lastColumn="0" w:oddVBand="0" w:evenVBand="0" w:oddHBand="1" w:evenHBand="0" w:firstRowFirstColumn="0" w:firstRowLastColumn="0" w:lastRowFirstColumn="0" w:lastRowLastColumn="0"/>
+          <w:trHeight w:val="340"/>
+        </w:trPr>
+        <w:tc>
+          <w:tcPr>
+            <w:cnfStyle w:val="001000000000" w:firstRow="0" w:lastRow="0" w:firstColumn="1" w:lastColumn="0" w:oddVBand="0" w:evenVBand="0" w:oddHBand="0" w:evenHBand="0" w:firstRowFirstColumn="0" w:firstRowLastColumn="0" w:lastRowFirstColumn="0" w:lastRowLastColumn="0"/>
+            <w:tcW w:w="0" w:type="auto"/>
+            <w:hideMark/>
+          </w:tcPr>
+          <w:p>
+            <w:pPr>
+              <w:spacing w:after="160"/>
+              <w:rPr>
+                <w:rFonts w:ascii="Times New Roman" w:hAnsi="Times New Roman" w:cs="Times New Roman"/>
+                <w:lang w:val="en-IN"/>
+              </w:rPr>
+            </w:pPr>
+            <w:r>
+              <w:rPr>
+                <w:rFonts w:ascii="Times New Roman" w:hAnsi="Times New Roman" w:cs="Times New Roman"/>
+                <w:lang w:val="en-IN"/>
+              </w:rPr>
+              <w:t>User</w:t>
+            </w:r>
+          </w:p>
+        </w:tc>
+        <w:tc>
+          <w:tcPr>
+            <w:tcW w:w="0" w:type="auto"/>
+            <w:hideMark/>
+          </w:tcPr>
+          <w:p>
+            <w:pPr>
+              <w:spacing w:after="160"/>
+              <w:cnfStyle w:val="000000100000" w:firstRow="0" w:lastRow="0" w:firstColumn="0" w:lastColumn="0" w:oddVBand="0" w:evenVBand="0" w:oddHBand="1" w:evenHBand="0" w:firstRowFirstColumn="0" w:firstRowLastColumn="0" w:lastRowFirstColumn="0" w:lastRowLastColumn="0"/>
+              <w:rPr>
+                <w:rFonts w:ascii="Times New Roman" w:hAnsi="Times New Roman" w:cs="Times New Roman"/>
+                <w:lang w:val="en-IN"/>
+              </w:rPr>
+            </w:pPr>
+            <w:r>
+              <w:rPr>
+                <w:rFonts w:ascii="Times New Roman" w:hAnsi="Times New Roman" w:cs="Times New Roman"/>
+                <w:lang w:val="en-IN"/>
+              </w:rPr>
+              <w:t>Platform users</w:t>
+            </w:r>
+          </w:p>
+        </w:tc>
+        <w:tc>
+          <w:tcPr>
+            <w:tcW w:w="0" w:type="auto"/>
+            <w:hideMark/>
+          </w:tcPr>
+          <w:p>
+            <w:pPr>
+              <w:spacing w:after="160"/>
+              <w:cnfStyle w:val="000000100000" w:firstRow="0" w:lastRow="0" w:firstColumn="0" w:lastColumn="0" w:oddVBand="0" w:evenVBand="0" w:oddHBand="1" w:evenHBand="0" w:firstRowFirstColumn="0" w:firstRowLastColumn="0" w:lastRowFirstColumn="0" w:lastRowLastColumn="0"/>
+              <w:rPr>
+                <w:rFonts w:ascii="Times New Roman" w:hAnsi="Times New Roman" w:cs="Times New Roman"/>
+                <w:lang w:val="en-IN"/>
+              </w:rPr>
+            </w:pPr>
+            <w:r>
+              <w:rPr>
+                <w:rFonts w:ascii="Times New Roman" w:hAnsi="Times New Roman" w:cs="Times New Roman"/>
+                <w:lang w:val="en-IN"/>
+              </w:rPr>
+              <w:t xml:space="preserve">id, email, role, </w:t>
+            </w:r>
+            <w:proofErr w:type="spellStart"/>
+            <w:r>
+              <w:rPr>
+                <w:rFonts w:ascii="Times New Roman" w:hAnsi="Times New Roman" w:cs="Times New Roman"/>
+                <w:lang w:val="en-IN"/>
+              </w:rPr>
+              <w:t>isVerified</w:t>
+            </w:r>
+            <w:proofErr w:type="spellEnd"/>
+          </w:p>
+        </w:tc>
+      </w:tr>
+      <w:tr>
+        <w:trPr>
+          <w:trHeight w:val="340"/>
+        </w:trPr>
+        <w:tc>
+          <w:tcPr>
+            <w:cnfStyle w:val="001000000000" w:firstRow="0" w:lastRow="0" w:firstColumn="1" w:lastColumn="0" w:oddVBand="0" w:evenVBand="0" w:oddHBand="0" w:evenHBand="0" w:firstRowFirstColumn="0" w:firstRowLastColumn="0" w:lastRowFirstColumn="0" w:lastRowLastColumn="0"/>
+            <w:tcW w:w="0" w:type="auto"/>
+            <w:hideMark/>
+          </w:tcPr>
+          <w:p>
+            <w:pPr>
+              <w:spacing w:after="160"/>
+              <w:rPr>
+                <w:rFonts w:ascii="Times New Roman" w:hAnsi="Times New Roman" w:cs="Times New Roman"/>
+                <w:lang w:val="en-IN"/>
+              </w:rPr>
+            </w:pPr>
+            <w:r>
+              <w:rPr>
+                <w:rFonts w:ascii="Times New Roman" w:hAnsi="Times New Roman" w:cs="Times New Roman"/>
+                <w:lang w:val="en-IN"/>
+              </w:rPr>
+              <w:t>Property</w:t>
+            </w:r>
+          </w:p>
+        </w:tc>
+        <w:tc>
+          <w:tcPr>
+            <w:tcW w:w="0" w:type="auto"/>
+            <w:hideMark/>
+          </w:tcPr>
+          <w:p>
+            <w:pPr>
+              <w:spacing w:after="160"/>
+              <w:cnfStyle w:val="000000000000" w:firstRow="0" w:lastRow="0" w:firstColumn="0" w:lastColumn="0" w:oddVBand="0" w:evenVBand="0" w:oddHBand="0" w:evenHBand="0" w:firstRowFirstColumn="0" w:firstRowLastColumn="0" w:lastRowFirstColumn="0" w:lastRowLastColumn="0"/>
+              <w:rPr>
+                <w:rFonts w:ascii="Times New Roman" w:hAnsi="Times New Roman" w:cs="Times New Roman"/>
+                <w:lang w:val="en-IN"/>
+              </w:rPr>
+            </w:pPr>
+            <w:r>
+              <w:rPr>
+                <w:rFonts w:ascii="Times New Roman" w:hAnsi="Times New Roman" w:cs="Times New Roman"/>
+                <w:lang w:val="en-IN"/>
+              </w:rPr>
+              <w:t>Rental listings</w:t>
+            </w:r>
+          </w:p>
+        </w:tc>
+        <w:tc>
+          <w:tcPr>
+            <w:tcW w:w="0" w:type="auto"/>
+            <w:hideMark/>
+          </w:tcPr>
+          <w:p>
+            <w:pPr>
+              <w:spacing w:after="160"/>
+              <w:cnfStyle w:val="000000000000" w:firstRow="0" w:lastRow="0" w:firstColumn="0" w:lastColumn="0" w:oddVBand="0" w:evenVBand="0" w:oddHBand="0" w:evenHBand="0" w:firstRowFirstColumn="0" w:firstRowLastColumn="0" w:lastRowFirstColumn="0" w:lastRowLastColumn="0"/>
+              <w:rPr>
+                <w:rFonts w:ascii="Times New Roman" w:hAnsi="Times New Roman" w:cs="Times New Roman"/>
+                <w:lang w:val="en-IN"/>
+              </w:rPr>
+            </w:pPr>
+            <w:proofErr w:type="spellStart"/>
+            <w:r>
+              <w:rPr>
+                <w:rFonts w:ascii="Times New Roman" w:hAnsi="Times New Roman" w:cs="Times New Roman"/>
+                <w:lang w:val="en-IN"/>
+              </w:rPr>
+              <w:t>landlordId</w:t>
+            </w:r>
+            <w:proofErr w:type="spellEnd"/>
+            <w:r>
+              <w:rPr>
+                <w:rFonts w:ascii="Times New Roman" w:hAnsi="Times New Roman" w:cs="Times New Roman"/>
+                <w:lang w:val="en-IN"/>
+              </w:rPr>
+              <w:t xml:space="preserve">, rent, </w:t>
+            </w:r>
+            <w:proofErr w:type="spellStart"/>
+            <w:r>
+              <w:rPr>
+                <w:rFonts w:ascii="Times New Roman" w:hAnsi="Times New Roman" w:cs="Times New Roman"/>
+                <w:lang w:val="en-IN"/>
+              </w:rPr>
+              <w:t>bhk</w:t>
+            </w:r>
+            <w:proofErr w:type="spellEnd"/>
+            <w:r>
+              <w:rPr>
+                <w:rFonts w:ascii="Times New Roman" w:hAnsi="Times New Roman" w:cs="Times New Roman"/>
+                <w:lang w:val="en-IN"/>
+              </w:rPr>
+              <w:t>, amenities, metro distance</w:t>
+            </w:r>
+          </w:p>
+        </w:tc>
+      </w:tr>
+      <w:tr>
+        <w:trPr>
+          <w:cnfStyle w:val="000000100000" w:firstRow="0" w:lastRow="0" w:firstColumn="0" w:lastColumn="0" w:oddVBand="0" w:evenVBand="0" w:oddHBand="1" w:evenHBand="0" w:firstRowFirstColumn="0" w:firstRowLastColumn="0" w:lastRowFirstColumn="0" w:lastRowLastColumn="0"/>
+          <w:trHeight w:val="340"/>
+        </w:trPr>
+        <w:tc>
+          <w:tcPr>
+            <w:cnfStyle w:val="001000000000" w:firstRow="0" w:lastRow="0" w:firstColumn="1" w:lastColumn="0" w:oddVBand="0" w:evenVBand="0" w:oddHBand="0" w:evenHBand="0" w:firstRowFirstColumn="0" w:firstRowLastColumn="0" w:lastRowFirstColumn="0" w:lastRowLastColumn="0"/>
+            <w:tcW w:w="0" w:type="auto"/>
+            <w:hideMark/>
+          </w:tcPr>
+          <w:p>
+            <w:pPr>
+              <w:spacing w:after="160"/>
+              <w:rPr>
+                <w:rFonts w:ascii="Times New Roman" w:hAnsi="Times New Roman" w:cs="Times New Roman"/>
+                <w:lang w:val="en-IN"/>
+              </w:rPr>
+            </w:pPr>
+            <w:proofErr w:type="spellStart"/>
+            <w:r>
+              <w:rPr>
+                <w:rFonts w:ascii="Times New Roman" w:hAnsi="Times New Roman" w:cs="Times New Roman"/>
+                <w:lang w:val="en-IN"/>
+              </w:rPr>
+              <w:t>PropertyImage</w:t>
+            </w:r>
+            <w:proofErr w:type="spellEnd"/>
+          </w:p>
+        </w:tc>
+        <w:tc>
+          <w:tcPr>
+            <w:tcW w:w="0" w:type="auto"/>
+            <w:hideMark/>
+          </w:tcPr>
+          <w:p>
+            <w:pPr>
+              <w:spacing w:after="160"/>
+              <w:cnfStyle w:val="000000100000" w:firstRow="0" w:lastRow="0" w:firstColumn="0" w:lastColumn="0" w:oddVBand="0" w:evenVBand="0" w:oddHBand="1" w:evenHBand="0" w:firstRowFirstColumn="0" w:firstRowLastColumn="0" w:lastRowFirstColumn="0" w:lastRowLastColumn="0"/>
+              <w:rPr>
+                <w:rFonts w:ascii="Times New Roman" w:hAnsi="Times New Roman" w:cs="Times New Roman"/>
+                <w:lang w:val="en-IN"/>
+              </w:rPr>
+            </w:pPr>
+            <w:r>
+              <w:rPr>
+                <w:rFonts w:ascii="Times New Roman" w:hAnsi="Times New Roman" w:cs="Times New Roman"/>
+                <w:lang w:val="en-IN"/>
+              </w:rPr>
+              <w:t>Property photos</w:t>
+            </w:r>
+          </w:p>
+        </w:tc>
+        <w:tc>
+          <w:tcPr>
+            <w:tcW w:w="0" w:type="auto"/>
+            <w:hideMark/>
+          </w:tcPr>
+          <w:p>
+            <w:pPr>
+              <w:spacing w:after="160"/>
+              <w:cnfStyle w:val="000000100000" w:firstRow="0" w:lastRow="0" w:firstColumn="0" w:lastColumn="0" w:oddVBand="0" w:evenVBand="0" w:oddHBand="1" w:evenHBand="0" w:firstRowFirstColumn="0" w:firstRowLastColumn="0" w:lastRowFirstColumn="0" w:lastRowLastColumn="0"/>
+              <w:rPr>
+                <w:rFonts w:ascii="Times New Roman" w:hAnsi="Times New Roman" w:cs="Times New Roman"/>
+                <w:lang w:val="en-IN"/>
+              </w:rPr>
+            </w:pPr>
+            <w:proofErr w:type="spellStart"/>
+            <w:r>
+              <w:rPr>
+                <w:rFonts w:ascii="Times New Roman" w:hAnsi="Times New Roman" w:cs="Times New Roman"/>
+                <w:lang w:val="en-IN"/>
+              </w:rPr>
+              <w:t>propertyId</w:t>
+            </w:r>
+            <w:proofErr w:type="spellEnd"/>
+            <w:r>
+              <w:rPr>
+                <w:rFonts w:ascii="Times New Roman" w:hAnsi="Times New Roman" w:cs="Times New Roman"/>
+                <w:lang w:val="en-IN"/>
+              </w:rPr>
+              <w:t xml:space="preserve">, </w:t>
+            </w:r>
+            <w:proofErr w:type="spellStart"/>
+            <w:r>
+              <w:rPr>
+                <w:rFonts w:ascii="Times New Roman" w:hAnsi="Times New Roman" w:cs="Times New Roman"/>
+                <w:lang w:val="en-IN"/>
+              </w:rPr>
+              <w:t>imageUrl</w:t>
+            </w:r>
+            <w:proofErr w:type="spellEnd"/>
+            <w:r>
+              <w:rPr>
+                <w:rFonts w:ascii="Times New Roman" w:hAnsi="Times New Roman" w:cs="Times New Roman"/>
+                <w:lang w:val="en-IN"/>
+              </w:rPr>
+              <w:t xml:space="preserve">, </w:t>
+            </w:r>
+            <w:proofErr w:type="spellStart"/>
+            <w:r>
+              <w:rPr>
+                <w:rFonts w:ascii="Times New Roman" w:hAnsi="Times New Roman" w:cs="Times New Roman"/>
+                <w:lang w:val="en-IN"/>
+              </w:rPr>
+              <w:t>isPrimary</w:t>
+            </w:r>
+            <w:proofErr w:type="spellEnd"/>
+          </w:p>
+        </w:tc>
+      </w:tr>
+      <w:tr>
+        <w:trPr>
+          <w:trHeight w:val="340"/>
+        </w:trPr>
+        <w:tc>
+          <w:tcPr>
+            <w:cnfStyle w:val="001000000000" w:firstRow="0" w:lastRow="0" w:firstColumn="1" w:lastColumn="0" w:oddVBand="0" w:evenVBand="0" w:oddHBand="0" w:evenHBand="0" w:firstRowFirstColumn="0" w:firstRowLastColumn="0" w:lastRowFirstColumn="0" w:lastRowLastColumn="0"/>
+            <w:tcW w:w="0" w:type="auto"/>
+            <w:hideMark/>
+          </w:tcPr>
+          <w:p>
+            <w:pPr>
+              <w:spacing w:after="160"/>
+              <w:rPr>
+                <w:rFonts w:ascii="Times New Roman" w:hAnsi="Times New Roman" w:cs="Times New Roman"/>
+                <w:lang w:val="en-IN"/>
+              </w:rPr>
+            </w:pPr>
+            <w:r>
+              <w:rPr>
+                <w:rFonts w:ascii="Times New Roman" w:hAnsi="Times New Roman" w:cs="Times New Roman"/>
+                <w:lang w:val="en-IN"/>
+              </w:rPr>
+              <w:t>Wishlist</w:t>
+            </w:r>
+          </w:p>
+        </w:tc>
+        <w:tc>
+          <w:tcPr>
+            <w:tcW w:w="0" w:type="auto"/>
+            <w:hideMark/>
+          </w:tcPr>
+          <w:p>
+            <w:pPr>
+              <w:spacing w:after="160"/>
+              <w:cnfStyle w:val="000000000000" w:firstRow="0" w:lastRow="0" w:firstColumn="0" w:lastColumn="0" w:oddVBand="0" w:evenVBand="0" w:oddHBand="0" w:evenHBand="0" w:firstRowFirstColumn="0" w:firstRowLastColumn="0" w:lastRowFirstColumn="0" w:lastRowLastColumn="0"/>
+              <w:rPr>
+                <w:rFonts w:ascii="Times New Roman" w:hAnsi="Times New Roman" w:cs="Times New Roman"/>
+                <w:lang w:val="en-IN"/>
+              </w:rPr>
+            </w:pPr>
+            <w:r>
+              <w:rPr>
+                <w:rFonts w:ascii="Times New Roman" w:hAnsi="Times New Roman" w:cs="Times New Roman"/>
+                <w:lang w:val="en-IN"/>
+              </w:rPr>
+              <w:t>Saved properties</w:t>
+            </w:r>
+          </w:p>
+        </w:tc>
+        <w:tc>
+          <w:tcPr>
+            <w:tcW w:w="0" w:type="auto"/>
+            <w:hideMark/>
+          </w:tcPr>
+          <w:p>
+            <w:pPr>
+              <w:spacing w:after="160"/>
+              <w:cnfStyle w:val="000000000000" w:firstRow="0" w:lastRow="0" w:firstColumn="0" w:lastColumn="0" w:oddVBand="0" w:evenVBand="0" w:oddHBand="0" w:evenHBand="0" w:firstRowFirstColumn="0" w:firstRowLastColumn="0" w:lastRowFirstColumn="0" w:lastRowLastColumn="0"/>
+              <w:rPr>
+                <w:rFonts w:ascii="Times New Roman" w:hAnsi="Times New Roman" w:cs="Times New Roman"/>
+                <w:lang w:val="en-IN"/>
+              </w:rPr>
+            </w:pPr>
+            <w:proofErr w:type="spellStart"/>
+            <w:r>
+              <w:rPr>
+                <w:rFonts w:ascii="Times New Roman" w:hAnsi="Times New Roman" w:cs="Times New Roman"/>
+                <w:lang w:val="en-IN"/>
+              </w:rPr>
+              <w:t>tenantId</w:t>
+            </w:r>
+            <w:proofErr w:type="spellEnd"/>
+            <w:r>
+              <w:rPr>
+                <w:rFonts w:ascii="Times New Roman" w:hAnsi="Times New Roman" w:cs="Times New Roman"/>
+                <w:lang w:val="en-IN"/>
+              </w:rPr>
+              <w:t xml:space="preserve">, </w:t>
+            </w:r>
+            <w:proofErr w:type="spellStart"/>
+            <w:r>
+              <w:rPr>
+                <w:rFonts w:ascii="Times New Roman" w:hAnsi="Times New Roman" w:cs="Times New Roman"/>
+                <w:lang w:val="en-IN"/>
+              </w:rPr>
+              <w:t>propertyId</w:t>
+            </w:r>
+            <w:proofErr w:type="spellEnd"/>
+          </w:p>
+        </w:tc>
+      </w:tr>
+      <w:tr>
+        <w:trPr>
+          <w:cnfStyle w:val="000000100000" w:firstRow="0" w:lastRow="0" w:firstColumn="0" w:lastColumn="0" w:oddVBand="0" w:evenVBand="0" w:oddHBand="1" w:evenHBand="0" w:firstRowFirstColumn="0" w:firstRowLastColumn="0" w:lastRowFirstColumn="0" w:lastRowLastColumn="0"/>
+          <w:trHeight w:val="340"/>
+        </w:trPr>
+        <w:tc>
+          <w:tcPr>
+            <w:cnfStyle w:val="001000000000" w:firstRow="0" w:lastRow="0" w:firstColumn="1" w:lastColumn="0" w:oddVBand="0" w:evenVBand="0" w:oddHBand="0" w:evenHBand="0" w:firstRowFirstColumn="0" w:firstRowLastColumn="0" w:lastRowFirstColumn="0" w:lastRowLastColumn="0"/>
+            <w:tcW w:w="0" w:type="auto"/>
+            <w:hideMark/>
+          </w:tcPr>
+          <w:p>
+            <w:pPr>
+              <w:spacing w:after="160"/>
+              <w:rPr>
+                <w:rFonts w:ascii="Times New Roman" w:hAnsi="Times New Roman" w:cs="Times New Roman"/>
+                <w:lang w:val="en-IN"/>
+              </w:rPr>
+            </w:pPr>
+            <w:proofErr w:type="spellStart"/>
+            <w:r>
+              <w:rPr>
+                <w:rFonts w:ascii="Times New Roman" w:hAnsi="Times New Roman" w:cs="Times New Roman"/>
+                <w:lang w:val="en-IN"/>
+              </w:rPr>
+              <w:t>VisitSchedule</w:t>
+            </w:r>
+            <w:proofErr w:type="spellEnd"/>
+          </w:p>
+        </w:tc>
+        <w:tc>
+          <w:tcPr>
+            <w:tcW w:w="0" w:type="auto"/>
+            <w:hideMark/>
+          </w:tcPr>
+          <w:p>
+            <w:pPr>
+              <w:spacing w:after="160"/>
+              <w:cnfStyle w:val="000000100000" w:firstRow="0" w:lastRow="0" w:firstColumn="0" w:lastColumn="0" w:oddVBand="0" w:evenVBand="0" w:oddHBand="1" w:evenHBand="0" w:firstRowFirstColumn="0" w:firstRowLastColumn="0" w:lastRowFirstColumn="0" w:lastRowLastColumn="0"/>
+              <w:rPr>
+                <w:rFonts w:ascii="Times New Roman" w:hAnsi="Times New Roman" w:cs="Times New Roman"/>
+                <w:lang w:val="en-IN"/>
+              </w:rPr>
+            </w:pPr>
+            <w:r>
+              <w:rPr>
+                <w:rFonts w:ascii="Times New Roman" w:hAnsi="Times New Roman" w:cs="Times New Roman"/>
+                <w:lang w:val="en-IN"/>
+              </w:rPr>
+              <w:t>Property visits</w:t>
+            </w:r>
+          </w:p>
+        </w:tc>
+        <w:tc>
+          <w:tcPr>
+            <w:tcW w:w="0" w:type="auto"/>
+            <w:hideMark/>
+          </w:tcPr>
+          <w:p>
+            <w:pPr>
+              <w:spacing w:after="160"/>
+              <w:cnfStyle w:val="000000100000" w:firstRow="0" w:lastRow="0" w:firstColumn="0" w:lastColumn="0" w:oddVBand="0" w:evenVBand="0" w:oddHBand="1" w:evenHBand="0" w:firstRowFirstColumn="0" w:firstRowLastColumn="0" w:lastRowFirstColumn="0" w:lastRowLastColumn="0"/>
+              <w:rPr>
+                <w:rFonts w:ascii="Times New Roman" w:hAnsi="Times New Roman" w:cs="Times New Roman"/>
+                <w:lang w:val="en-IN"/>
+              </w:rPr>
+            </w:pPr>
+            <w:proofErr w:type="spellStart"/>
+            <w:r>
+              <w:rPr>
+                <w:rFonts w:ascii="Times New Roman" w:hAnsi="Times New Roman" w:cs="Times New Roman"/>
+                <w:lang w:val="en-IN"/>
+              </w:rPr>
+              <w:t>tenantId</w:t>
+            </w:r>
+            <w:proofErr w:type="spellEnd"/>
+            <w:r>
+              <w:rPr>
+                <w:rFonts w:ascii="Times New Roman" w:hAnsi="Times New Roman" w:cs="Times New Roman"/>
+                <w:lang w:val="en-IN"/>
+              </w:rPr>
+              <w:t xml:space="preserve">, </w:t>
+            </w:r>
+            <w:proofErr w:type="spellStart"/>
+            <w:r>
+              <w:rPr>
+                <w:rFonts w:ascii="Times New Roman" w:hAnsi="Times New Roman" w:cs="Times New Roman"/>
+                <w:lang w:val="en-IN"/>
+              </w:rPr>
+              <w:t>propertyId</w:t>
+            </w:r>
+            <w:proofErr w:type="spellEnd"/>
+            <w:r>
+              <w:rPr>
+                <w:rFonts w:ascii="Times New Roman" w:hAnsi="Times New Roman" w:cs="Times New Roman"/>
+                <w:lang w:val="en-IN"/>
+              </w:rPr>
+              <w:t xml:space="preserve">, </w:t>
+            </w:r>
+            <w:proofErr w:type="spellStart"/>
+            <w:r>
+              <w:rPr>
+                <w:rFonts w:ascii="Times New Roman" w:hAnsi="Times New Roman" w:cs="Times New Roman"/>
+                <w:lang w:val="en-IN"/>
+              </w:rPr>
+              <w:t>scheduledDate</w:t>
+            </w:r>
+            <w:proofErr w:type="spellEnd"/>
+          </w:p>
+        </w:tc>
+      </w:tr>
+      <w:tr>
+        <w:trPr>
+          <w:trHeight w:val="340"/>
+        </w:trPr>
+        <w:tc>
+          <w:tcPr>
+            <w:cnfStyle w:val="001000000000" w:firstRow="0" w:lastRow="0" w:firstColumn="1" w:lastColumn="0" w:oddVBand="0" w:evenVBand="0" w:oddHBand="0" w:evenHBand="0" w:firstRowFirstColumn="0" w:firstRowLastColumn="0" w:lastRowFirstColumn="0" w:lastRowLastColumn="0"/>
+            <w:tcW w:w="0" w:type="auto"/>
+            <w:hideMark/>
+          </w:tcPr>
+          <w:p>
+            <w:pPr>
+              <w:spacing w:after="160"/>
+              <w:rPr>
+                <w:rFonts w:ascii="Times New Roman" w:hAnsi="Times New Roman" w:cs="Times New Roman"/>
+                <w:lang w:val="en-IN"/>
+              </w:rPr>
+            </w:pPr>
+            <w:r>
+              <w:rPr>
+                <w:rFonts w:ascii="Times New Roman" w:hAnsi="Times New Roman" w:cs="Times New Roman"/>
+                <w:lang w:val="en-IN"/>
+              </w:rPr>
+              <w:t>Lead</w:t>
+            </w:r>
+          </w:p>
+        </w:tc>
+        <w:tc>
+          <w:tcPr>
+            <w:tcW w:w="0" w:type="auto"/>
+            <w:hideMark/>
+          </w:tcPr>
+          <w:p>
+            <w:pPr>
+              <w:spacing w:after="160"/>
+              <w:cnfStyle w:val="000000000000" w:firstRow="0" w:lastRow="0" w:firstColumn="0" w:lastColumn="0" w:oddVBand="0" w:evenVBand="0" w:oddHBand="0" w:evenHBand="0" w:firstRowFirstColumn="0" w:firstRowLastColumn="0" w:lastRowFirstColumn="0" w:lastRowLastColumn="0"/>
+              <w:rPr>
+                <w:rFonts w:ascii="Times New Roman" w:hAnsi="Times New Roman" w:cs="Times New Roman"/>
+                <w:lang w:val="en-IN"/>
+              </w:rPr>
+            </w:pPr>
+            <w:r>
+              <w:rPr>
+                <w:rFonts w:ascii="Times New Roman" w:hAnsi="Times New Roman" w:cs="Times New Roman"/>
+                <w:lang w:val="en-IN"/>
+              </w:rPr>
+              <w:t>Tenant inquiries</w:t>
+            </w:r>
+          </w:p>
+        </w:tc>
+        <w:tc>
+          <w:tcPr>
+            <w:tcW w:w="0" w:type="auto"/>
+            <w:hideMark/>
+          </w:tcPr>
+          <w:p>
+            <w:pPr>
+              <w:spacing w:after="160"/>
+              <w:cnfStyle w:val="000000000000" w:firstRow="0" w:lastRow="0" w:firstColumn="0" w:lastColumn="0" w:oddVBand="0" w:evenVBand="0" w:oddHBand="0" w:evenHBand="0" w:firstRowFirstColumn="0" w:firstRowLastColumn="0" w:lastRowFirstColumn="0" w:lastRowLastColumn="0"/>
+              <w:rPr>
+                <w:rFonts w:ascii="Times New Roman" w:hAnsi="Times New Roman" w:cs="Times New Roman"/>
+                <w:lang w:val="en-IN"/>
+              </w:rPr>
+            </w:pPr>
+            <w:proofErr w:type="spellStart"/>
+            <w:r>
+              <w:rPr>
+                <w:rFonts w:ascii="Times New Roman" w:hAnsi="Times New Roman" w:cs="Times New Roman"/>
+                <w:lang w:val="en-IN"/>
+              </w:rPr>
+              <w:t>propertyId</w:t>
+            </w:r>
+            <w:proofErr w:type="spellEnd"/>
+            <w:r>
+              <w:rPr>
+                <w:rFonts w:ascii="Times New Roman" w:hAnsi="Times New Roman" w:cs="Times New Roman"/>
+                <w:lang w:val="en-IN"/>
+              </w:rPr>
+              <w:t xml:space="preserve">, </w:t>
+            </w:r>
+            <w:proofErr w:type="spellStart"/>
+            <w:r>
+              <w:rPr>
+                <w:rFonts w:ascii="Times New Roman" w:hAnsi="Times New Roman" w:cs="Times New Roman"/>
+                <w:lang w:val="en-IN"/>
+              </w:rPr>
+              <w:t>tenantId</w:t>
+            </w:r>
+            <w:proofErr w:type="spellEnd"/>
+            <w:r>
+              <w:rPr>
+                <w:rFonts w:ascii="Times New Roman" w:hAnsi="Times New Roman" w:cs="Times New Roman"/>
+                <w:lang w:val="en-IN"/>
+              </w:rPr>
+              <w:t>, status</w:t>
+            </w:r>
+          </w:p>
+        </w:tc>
+      </w:tr>
+      <w:tr>
+        <w:trPr>
+          <w:cnfStyle w:val="000000100000" w:firstRow="0" w:lastRow="0" w:firstColumn="0" w:lastColumn="0" w:oddVBand="0" w:evenVBand="0" w:oddHBand="1" w:evenHBand="0" w:firstRowFirstColumn="0" w:firstRowLastColumn="0" w:lastRowFirstColumn="0" w:lastRowLastColumn="0"/>
+          <w:trHeight w:val="340"/>
+        </w:trPr>
+        <w:tc>
+          <w:tcPr>
+            <w:cnfStyle w:val="001000000000" w:firstRow="0" w:lastRow="0" w:firstColumn="1" w:lastColumn="0" w:oddVBand="0" w:evenVBand="0" w:oddHBand="0" w:evenHBand="0" w:firstRowFirstColumn="0" w:firstRowLastColumn="0" w:lastRowFirstColumn="0" w:lastRowLastColumn="0"/>
+            <w:tcW w:w="0" w:type="auto"/>
+            <w:hideMark/>
+          </w:tcPr>
+          <w:p>
+            <w:pPr>
+              <w:spacing w:after="160"/>
+              <w:rPr>
+                <w:rFonts w:ascii="Times New Roman" w:hAnsi="Times New Roman" w:cs="Times New Roman"/>
+                <w:lang w:val="en-IN"/>
+              </w:rPr>
+            </w:pPr>
+            <w:proofErr w:type="spellStart"/>
+            <w:r>
+              <w:rPr>
+                <w:rFonts w:ascii="Times New Roman" w:hAnsi="Times New Roman" w:cs="Times New Roman"/>
+                <w:lang w:val="en-IN"/>
+              </w:rPr>
+              <w:t>RentAgreement</w:t>
+            </w:r>
+            <w:proofErr w:type="spellEnd"/>
+          </w:p>
+        </w:tc>
+        <w:tc>
+          <w:tcPr>
+            <w:tcW w:w="0" w:type="auto"/>
+            <w:hideMark/>
+          </w:tcPr>
+          <w:p>
+            <w:pPr>
+              <w:spacing w:after="160"/>
+              <w:cnfStyle w:val="000000100000" w:firstRow="0" w:lastRow="0" w:firstColumn="0" w:lastColumn="0" w:oddVBand="0" w:evenVBand="0" w:oddHBand="1" w:evenHBand="0" w:firstRowFirstColumn="0" w:firstRowLastColumn="0" w:lastRowFirstColumn="0" w:lastRowLastColumn="0"/>
+              <w:rPr>
+                <w:rFonts w:ascii="Times New Roman" w:hAnsi="Times New Roman" w:cs="Times New Roman"/>
+                <w:lang w:val="en-IN"/>
+              </w:rPr>
+            </w:pPr>
+            <w:r>
+              <w:rPr>
+                <w:rFonts w:ascii="Times New Roman" w:hAnsi="Times New Roman" w:cs="Times New Roman"/>
+                <w:lang w:val="en-IN"/>
+              </w:rPr>
+              <w:t>Generated agreements</w:t>
+            </w:r>
+          </w:p>
+        </w:tc>
+        <w:tc>
+          <w:tcPr>
+            <w:tcW w:w="0" w:type="auto"/>
+            <w:hideMark/>
+          </w:tcPr>
+          <w:p>
+            <w:pPr>
+              <w:spacing w:after="160"/>
+              <w:cnfStyle w:val="000000100000" w:firstRow="0" w:lastRow="0" w:firstColumn="0" w:lastColumn="0" w:oddVBand="0" w:evenVBand="0" w:oddHBand="1" w:evenHBand="0" w:firstRowFirstColumn="0" w:firstRowLastColumn="0" w:lastRowFirstColumn="0" w:lastRowLastColumn="0"/>
+              <w:rPr>
+                <w:rFonts w:ascii="Times New Roman" w:hAnsi="Times New Roman" w:cs="Times New Roman"/>
+                <w:lang w:val="en-IN"/>
+              </w:rPr>
+            </w:pPr>
+            <w:proofErr w:type="spellStart"/>
+            <w:r>
+              <w:rPr>
+                <w:rFonts w:ascii="Times New Roman" w:hAnsi="Times New Roman" w:cs="Times New Roman"/>
+                <w:lang w:val="en-IN"/>
+              </w:rPr>
+              <w:t>propertyId</w:t>
+            </w:r>
+            <w:proofErr w:type="spellEnd"/>
+            <w:r>
+              <w:rPr>
+                <w:rFonts w:ascii="Times New Roman" w:hAnsi="Times New Roman" w:cs="Times New Roman"/>
+                <w:lang w:val="en-IN"/>
+              </w:rPr>
+              <w:t xml:space="preserve">, </w:t>
+            </w:r>
+            <w:proofErr w:type="spellStart"/>
+            <w:r>
+              <w:rPr>
+                <w:rFonts w:ascii="Times New Roman" w:hAnsi="Times New Roman" w:cs="Times New Roman"/>
+                <w:lang w:val="en-IN"/>
+              </w:rPr>
+              <w:t>tenantName</w:t>
+            </w:r>
+            <w:proofErr w:type="spellEnd"/>
+            <w:r>
+              <w:rPr>
+                <w:rFonts w:ascii="Times New Roman" w:hAnsi="Times New Roman" w:cs="Times New Roman"/>
+                <w:lang w:val="en-IN"/>
+              </w:rPr>
+              <w:t xml:space="preserve">, </w:t>
+            </w:r>
+            <w:proofErr w:type="spellStart"/>
+            <w:r>
+              <w:rPr>
+                <w:rFonts w:ascii="Times New Roman" w:hAnsi="Times New Roman" w:cs="Times New Roman"/>
+                <w:lang w:val="en-IN"/>
+              </w:rPr>
+              <w:t>monthlyRent</w:t>
+            </w:r>
+            <w:proofErr w:type="spellEnd"/>
+          </w:p>
+        </w:tc>
+      </w:tr>
+      <w:tr>
+        <w:trPr>
+          <w:trHeight w:val="340"/>
+        </w:trPr>
+        <w:tc>
+          <w:tcPr>
+            <w:cnfStyle w:val="001000000000" w:firstRow="0" w:lastRow="0" w:firstColumn="1" w:lastColumn="0" w:oddVBand="0" w:evenVBand="0" w:oddHBand="0" w:evenHBand="0" w:firstRowFirstColumn="0" w:firstRowLastColumn="0" w:lastRowFirstColumn="0" w:lastRowLastColumn="0"/>
+            <w:tcW w:w="0" w:type="auto"/>
+            <w:hideMark/>
+          </w:tcPr>
+          <w:p>
+            <w:pPr>
+              <w:spacing w:after="160"/>
+              <w:rPr>
+                <w:rFonts w:ascii="Times New Roman" w:hAnsi="Times New Roman" w:cs="Times New Roman"/>
+                <w:lang w:val="en-IN"/>
+              </w:rPr>
+            </w:pPr>
+            <w:proofErr w:type="spellStart"/>
+            <w:r>
+              <w:rPr>
+                <w:rFonts w:ascii="Times New Roman" w:hAnsi="Times New Roman" w:cs="Times New Roman"/>
+                <w:lang w:val="en-IN"/>
+              </w:rPr>
+              <w:t>AnalyticsEvent</w:t>
+            </w:r>
+            <w:proofErr w:type="spellEnd"/>
+          </w:p>
+        </w:tc>
+        <w:tc>
+          <w:tcPr>
+            <w:tcW w:w="0" w:type="auto"/>
+            <w:hideMark/>
+          </w:tcPr>
+          <w:p>
+            <w:pPr>
+              <w:spacing w:after="160"/>
+              <w:cnfStyle w:val="000000000000" w:firstRow="0" w:lastRow="0" w:firstColumn="0" w:lastColumn="0" w:oddVBand="0" w:evenVBand="0" w:oddHBand="0" w:evenHBand="0" w:firstRowFirstColumn="0" w:firstRowLastColumn="0" w:lastRowFirstColumn="0" w:lastRowLastColumn="0"/>
+              <w:rPr>
+                <w:rFonts w:ascii="Times New Roman" w:hAnsi="Times New Roman" w:cs="Times New Roman"/>
+                <w:lang w:val="en-IN"/>
+              </w:rPr>
+            </w:pPr>
+            <w:r>
+              <w:rPr>
+                <w:rFonts w:ascii="Times New Roman" w:hAnsi="Times New Roman" w:cs="Times New Roman"/>
+                <w:lang w:val="en-IN"/>
+              </w:rPr>
+              <w:t>User tracking</w:t>
+            </w:r>
+          </w:p>
+        </w:tc>
+        <w:tc>
+          <w:tcPr>
+            <w:tcW w:w="0" w:type="auto"/>
+            <w:hideMark/>
+          </w:tcPr>
+          <w:p>
+            <w:pPr>
+              <w:spacing w:after="160"/>
+              <w:cnfStyle w:val="000000000000" w:firstRow="0" w:lastRow="0" w:firstColumn="0" w:lastColumn="0" w:oddVBand="0" w:evenVBand="0" w:oddHBand="0" w:evenHBand="0" w:firstRowFirstColumn="0" w:firstRowLastColumn="0" w:lastRowFirstColumn="0" w:lastRowLastColumn="0"/>
+              <w:rPr>
+                <w:rFonts w:ascii="Times New Roman" w:hAnsi="Times New Roman" w:cs="Times New Roman"/>
+                <w:lang w:val="en-IN"/>
+              </w:rPr>
+            </w:pPr>
+            <w:proofErr w:type="spellStart"/>
+            <w:r>
+              <w:rPr>
+                <w:rFonts w:ascii="Times New Roman" w:hAnsi="Times New Roman" w:cs="Times New Roman"/>
+                <w:lang w:val="en-IN"/>
+              </w:rPr>
+              <w:t>eventType</w:t>
+            </w:r>
+            <w:proofErr w:type="spellEnd"/>
+            <w:r>
+              <w:rPr>
+                <w:rFonts w:ascii="Times New Roman" w:hAnsi="Times New Roman" w:cs="Times New Roman"/>
+                <w:lang w:val="en-IN"/>
+              </w:rPr>
+              <w:t xml:space="preserve">, </w:t>
+            </w:r>
+            <w:proofErr w:type="spellStart"/>
+            <w:r>
+              <w:rPr>
+                <w:rFonts w:ascii="Times New Roman" w:hAnsi="Times New Roman" w:cs="Times New Roman"/>
+                <w:lang w:val="en-IN"/>
+              </w:rPr>
+              <w:t>userId</w:t>
+            </w:r>
+            <w:proofErr w:type="spellEnd"/>
+            <w:r>
+              <w:rPr>
+                <w:rFonts w:ascii="Times New Roman" w:hAnsi="Times New Roman" w:cs="Times New Roman"/>
+                <w:lang w:val="en-IN"/>
+              </w:rPr>
+              <w:t xml:space="preserve">, </w:t>
+            </w:r>
+            <w:proofErr w:type="spellStart"/>
+            <w:r>
+              <w:rPr>
+                <w:rFonts w:ascii="Times New Roman" w:hAnsi="Times New Roman" w:cs="Times New Roman"/>
+                <w:lang w:val="en-IN"/>
+              </w:rPr>
+              <w:t>propertyId</w:t>
+            </w:r>
+            <w:proofErr w:type="spellEnd"/>
+          </w:p>
+        </w:tc>
+      </w:tr>
+      <w:tr>
+        <w:trPr>
+          <w:cnfStyle w:val="000000100000" w:firstRow="0" w:lastRow="0" w:firstColumn="0" w:lastColumn="0" w:oddVBand="0" w:evenVBand="0" w:oddHBand="1" w:evenHBand="0" w:firstRowFirstColumn="0" w:firstRowLastColumn="0" w:lastRowFirstColumn="0" w:lastRowLastColumn="0"/>
+          <w:trHeight w:val="340"/>
+        </w:trPr>
+        <w:tc>
+          <w:tcPr>
+            <w:cnfStyle w:val="001000000000" w:firstRow="0" w:lastRow="0" w:firstColumn="1" w:lastColumn="0" w:oddVBand="0" w:evenVBand="0" w:oddHBand="0" w:evenHBand="0" w:firstRowFirstColumn="0" w:firstRowLastColumn="0" w:lastRowFirstColumn="0" w:lastRowLastColumn="0"/>
+            <w:tcW w:w="0" w:type="auto"/>
+            <w:hideMark/>
+          </w:tcPr>
+          <w:p>
+            <w:pPr>
+              <w:spacing w:after="160"/>
+              <w:rPr>
+                <w:rFonts w:ascii="Times New Roman" w:hAnsi="Times New Roman" w:cs="Times New Roman"/>
+                <w:lang w:val="en-IN"/>
+              </w:rPr>
+            </w:pPr>
+            <w:proofErr w:type="spellStart"/>
+            <w:r>
+              <w:rPr>
+                <w:rFonts w:ascii="Times New Roman" w:hAnsi="Times New Roman" w:cs="Times New Roman"/>
+                <w:lang w:val="en-IN"/>
+              </w:rPr>
+              <w:t>PropertyEmbedding</w:t>
+            </w:r>
+            <w:proofErr w:type="spellEnd"/>
+          </w:p>
+        </w:tc>
+        <w:tc>
+          <w:tcPr>
+            <w:tcW w:w="0" w:type="auto"/>
+            <w:hideMark/>
+          </w:tcPr>
+          <w:p>
+            <w:pPr>
+              <w:spacing w:after="160"/>
+              <w:cnfStyle w:val="000000100000" w:firstRow="0" w:lastRow="0" w:firstColumn="0" w:lastColumn="0" w:oddVBand="0" w:evenVBand="0" w:oddHBand="1" w:evenHBand="0" w:firstRowFirstColumn="0" w:firstRowLastColumn="0" w:lastRowFirstColumn="0" w:lastRowLastColumn="0"/>
+              <w:rPr>
+                <w:rFonts w:ascii="Times New Roman" w:hAnsi="Times New Roman" w:cs="Times New Roman"/>
+                <w:lang w:val="en-IN"/>
+              </w:rPr>
+            </w:pPr>
+            <w:r>
+              <w:rPr>
+                <w:rFonts w:ascii="Times New Roman" w:hAnsi="Times New Roman" w:cs="Times New Roman"/>
+                <w:lang w:val="en-IN"/>
+              </w:rPr>
+              <w:t>Vector embeddings</w:t>
+            </w:r>
+          </w:p>
+        </w:tc>
+        <w:tc>
+          <w:tcPr>
+            <w:tcW w:w="0" w:type="auto"/>
+            <w:hideMark/>
+          </w:tcPr>
+          <w:p>
+            <w:pPr>
+              <w:spacing w:after="160"/>
+              <w:cnfStyle w:val="000000100000" w:firstRow="0" w:lastRow="0" w:firstColumn="0" w:lastColumn="0" w:oddVBand="0" w:evenVBand="0" w:oddHBand="1" w:evenHBand="0" w:firstRowFirstColumn="0" w:firstRowLastColumn="0" w:lastRowFirstColumn="0" w:lastRowLastColumn="0"/>
+              <w:rPr>
+                <w:rFonts w:ascii="Times New Roman" w:hAnsi="Times New Roman" w:cs="Times New Roman"/>
+                <w:lang w:val="en-IN"/>
+              </w:rPr>
+            </w:pPr>
+            <w:proofErr w:type="spellStart"/>
+            <w:r>
+              <w:rPr>
+                <w:rFonts w:ascii="Times New Roman" w:hAnsi="Times New Roman" w:cs="Times New Roman"/>
+                <w:lang w:val="en-IN"/>
+              </w:rPr>
+              <w:t>propertyId</w:t>
+            </w:r>
+            <w:proofErr w:type="spellEnd"/>
+            <w:r>
+              <w:rPr>
+                <w:rFonts w:ascii="Times New Roman" w:hAnsi="Times New Roman" w:cs="Times New Roman"/>
+                <w:lang w:val="en-IN"/>
+              </w:rPr>
+              <w:t>, content, embedding (vector)</w:t>
+            </w:r>
+          </w:p>
+        </w:tc>
+      </w:tr>
+    </w:tbl>
+    <w:p>
+      <w:pPr>
+        <w:spacing w:after="160" w:line="259" w:lineRule="auto"/>
+        <w:rPr>
+          <w:b/>
+          <w:bCs/>
+          <w:lang w:val="en-IN"/>
+        </w:rPr>
+      </w:pPr>
+    </w:p>
+    <w:p>
+      <w:pPr>
+        <w:pStyle w:val="Heading3"/>
+        <w:rPr>
+          <w:rFonts w:ascii="Times New Roman" w:hAnsi="Times New Roman" w:cs="Times New Roman"/>
+        </w:rPr>
+      </w:pPr>
+      <w:r>
+        <w:rPr>
+          <w:rFonts w:ascii="Times New Roman" w:hAnsi="Times New Roman" w:cs="Times New Roman"/>
+        </w:rPr>
+        <w:t>Enums</w:t>
+      </w:r>
+    </w:p>
+    <w:tbl>
+      <w:tblPr>
+        <w:tblStyle w:val="PlainTable2"/>
+        <w:tblW w:w="10929" w:type="dxa"/>
+        <w:tblLook w:val="04A0" w:firstRow="1" w:lastRow="0" w:firstColumn="1" w:lastColumn="0" w:noHBand="0" w:noVBand="1"/>
+      </w:tblPr>
+      <w:tblGrid>
+        <w:gridCol w:w="2477"/>
+        <w:gridCol w:w="8452"/>
+      </w:tblGrid>
+      <w:tr>
+        <w:trPr>
+          <w:cnfStyle w:val="100000000000" w:firstRow="1" w:lastRow="0" w:firstColumn="0" w:lastColumn="0" w:oddVBand="0" w:evenVBand="0" w:oddHBand="0" w:evenHBand="0" w:firstRowFirstColumn="0" w:firstRowLastColumn="0" w:lastRowFirstColumn="0" w:lastRowLastColumn="0"/>
+          <w:trHeight w:val="421"/>
+        </w:trPr>
+        <w:tc>
+          <w:tcPr>
+            <w:cnfStyle w:val="001000000000" w:firstRow="0" w:lastRow="0" w:firstColumn="1" w:lastColumn="0" w:oddVBand="0" w:evenVBand="0" w:oddHBand="0" w:evenHBand="0" w:firstRowFirstColumn="0" w:firstRowLastColumn="0" w:lastRowFirstColumn="0" w:lastRowLastColumn="0"/>
+            <w:tcW w:w="0" w:type="auto"/>
+            <w:hideMark/>
+          </w:tcPr>
+          <w:p>
+            <w:pPr>
+              <w:spacing w:after="160" w:line="259" w:lineRule="auto"/>
+              <w:rPr>
+                <w:rFonts w:ascii="Times New Roman" w:hAnsi="Times New Roman" w:cs="Times New Roman"/>
+                <w:sz w:val="22"/>
+                <w:szCs w:val="22"/>
+                <w:lang w:val="en-IN"/>
+              </w:rPr>
+            </w:pPr>
+            <w:r>
+              <w:rPr>
+                <w:rFonts w:ascii="Times New Roman" w:hAnsi="Times New Roman" w:cs="Times New Roman"/>
+                <w:sz w:val="22"/>
+                <w:szCs w:val="22"/>
+                <w:lang w:val="en-IN"/>
+              </w:rPr>
+              <w:t>Enum</w:t>
+            </w:r>
+          </w:p>
+        </w:tc>
+        <w:tc>
+          <w:tcPr>
+            <w:tcW w:w="0" w:type="auto"/>
+            <w:hideMark/>
+          </w:tcPr>
+          <w:p>
+            <w:pPr>
+              <w:spacing w:after="160" w:line="259" w:lineRule="auto"/>
+              <w:cnfStyle w:val="100000000000" w:firstRow="1" w:lastRow="0" w:firstColumn="0" w:lastColumn="0" w:oddVBand="0" w:evenVBand="0" w:oddHBand="0" w:evenHBand="0" w:firstRowFirstColumn="0" w:firstRowLastColumn="0" w:lastRowFirstColumn="0" w:lastRowLastColumn="0"/>
+              <w:rPr>
+                <w:rFonts w:ascii="Times New Roman" w:hAnsi="Times New Roman" w:cs="Times New Roman"/>
+                <w:sz w:val="22"/>
+                <w:szCs w:val="22"/>
+                <w:lang w:val="en-IN"/>
+              </w:rPr>
+            </w:pPr>
+            <w:r>
+              <w:rPr>
+                <w:rFonts w:ascii="Times New Roman" w:hAnsi="Times New Roman" w:cs="Times New Roman"/>
+                <w:sz w:val="22"/>
+                <w:szCs w:val="22"/>
+                <w:lang w:val="en-IN"/>
+              </w:rPr>
+              <w:t>Values</w:t>
+            </w:r>
+          </w:p>
+        </w:tc>
+      </w:tr>
+      <w:tr>
+        <w:trPr>
+          <w:cnfStyle w:val="000000100000" w:firstRow="0" w:lastRow="0" w:firstColumn="0" w:lastColumn="0" w:oddVBand="0" w:evenVBand="0" w:oddHBand="1" w:evenHBand="0" w:firstRowFirstColumn="0" w:firstRowLastColumn="0" w:lastRowFirstColumn="0" w:lastRowLastColumn="0"/>
+          <w:trHeight w:val="421"/>
+        </w:trPr>
+        <w:tc>
+          <w:tcPr>
+            <w:cnfStyle w:val="001000000000" w:firstRow="0" w:lastRow="0" w:firstColumn="1" w:lastColumn="0" w:oddVBand="0" w:evenVBand="0" w:oddHBand="0" w:evenHBand="0" w:firstRowFirstColumn="0" w:firstRowLastColumn="0" w:lastRowFirstColumn="0" w:lastRowLastColumn="0"/>
+            <w:tcW w:w="0" w:type="auto"/>
+            <w:hideMark/>
+          </w:tcPr>
+          <w:p>
+            <w:pPr>
+              <w:spacing w:after="160" w:line="259" w:lineRule="auto"/>
+              <w:rPr>
+                <w:rFonts w:ascii="Times New Roman" w:hAnsi="Times New Roman" w:cs="Times New Roman"/>
+                <w:sz w:val="22"/>
+                <w:szCs w:val="22"/>
+                <w:lang w:val="en-IN"/>
+              </w:rPr>
+            </w:pPr>
+            <w:r>
+              <w:rPr>
+                <w:rFonts w:ascii="Times New Roman" w:hAnsi="Times New Roman" w:cs="Times New Roman"/>
+                <w:sz w:val="22"/>
+                <w:szCs w:val="22"/>
+                <w:lang w:val="en-IN"/>
+              </w:rPr>
+              <w:t>Role</w:t>
+            </w:r>
+          </w:p>
+        </w:tc>
+        <w:tc>
+          <w:tcPr>
+            <w:tcW w:w="0" w:type="auto"/>
+            <w:hideMark/>
+          </w:tcPr>
+          <w:p>
+            <w:pPr>
+              <w:spacing w:after="160" w:line="259" w:lineRule="auto"/>
+              <w:cnfStyle w:val="000000100000" w:firstRow="0" w:lastRow="0" w:firstColumn="0" w:lastColumn="0" w:oddVBand="0" w:evenVBand="0" w:oddHBand="1" w:evenHBand="0" w:firstRowFirstColumn="0" w:firstRowLastColumn="0" w:lastRowFirstColumn="0" w:lastRowLastColumn="0"/>
+              <w:rPr>
+                <w:rFonts w:ascii="Times New Roman" w:hAnsi="Times New Roman" w:cs="Times New Roman"/>
+                <w:sz w:val="22"/>
+                <w:szCs w:val="22"/>
+                <w:lang w:val="en-IN"/>
+              </w:rPr>
+            </w:pPr>
+            <w:r>
+              <w:rPr>
+                <w:rFonts w:ascii="Times New Roman" w:hAnsi="Times New Roman" w:cs="Times New Roman"/>
+                <w:sz w:val="22"/>
+                <w:szCs w:val="22"/>
+                <w:lang w:val="en-IN"/>
+              </w:rPr>
+              <w:t>TENANT, LANDLORD, ADMIN</w:t>
+            </w:r>
+          </w:p>
+        </w:tc>
+      </w:tr>
+      <w:tr>
+        <w:trPr>
+          <w:trHeight w:val="410"/>
+        </w:trPr>
+        <w:tc>
+          <w:tcPr>
+            <w:cnfStyle w:val="001000000000" w:firstRow="0" w:lastRow="0" w:firstColumn="1" w:lastColumn="0" w:oddVBand="0" w:evenVBand="0" w:oddHBand="0" w:evenHBand="0" w:firstRowFirstColumn="0" w:firstRowLastColumn="0" w:lastRowFirstColumn="0" w:lastRowLastColumn="0"/>
+            <w:tcW w:w="0" w:type="auto"/>
+            <w:hideMark/>
+          </w:tcPr>
+          <w:p>
+            <w:pPr>
+              <w:spacing w:after="160" w:line="259" w:lineRule="auto"/>
+              <w:rPr>
+                <w:rFonts w:ascii="Times New Roman" w:hAnsi="Times New Roman" w:cs="Times New Roman"/>
+                <w:sz w:val="22"/>
+                <w:szCs w:val="22"/>
+                <w:lang w:val="en-IN"/>
+              </w:rPr>
+            </w:pPr>
+            <w:proofErr w:type="spellStart"/>
+            <w:r>
+              <w:rPr>
+                <w:rFonts w:ascii="Times New Roman" w:hAnsi="Times New Roman" w:cs="Times New Roman"/>
+                <w:sz w:val="22"/>
+                <w:szCs w:val="22"/>
+                <w:lang w:val="en-IN"/>
+              </w:rPr>
+              <w:t>BHKType</w:t>
+            </w:r>
+            <w:proofErr w:type="spellEnd"/>
+          </w:p>
+        </w:tc>
+        <w:tc>
+          <w:tcPr>
+            <w:tcW w:w="0" w:type="auto"/>
+            <w:hideMark/>
+          </w:tcPr>
+          <w:p>
+            <w:pPr>
+              <w:spacing w:after="160" w:line="259" w:lineRule="auto"/>
+              <w:cnfStyle w:val="000000000000" w:firstRow="0" w:lastRow="0" w:firstColumn="0" w:lastColumn="0" w:oddVBand="0" w:evenVBand="0" w:oddHBand="0" w:evenHBand="0" w:firstRowFirstColumn="0" w:firstRowLastColumn="0" w:lastRowFirstColumn="0" w:lastRowLastColumn="0"/>
+              <w:rPr>
+                <w:rFonts w:ascii="Times New Roman" w:hAnsi="Times New Roman" w:cs="Times New Roman"/>
+                <w:sz w:val="22"/>
+                <w:szCs w:val="22"/>
+                <w:lang w:val="en-IN"/>
+              </w:rPr>
+            </w:pPr>
+            <w:r>
+              <w:rPr>
+                <w:rFonts w:ascii="Times New Roman" w:hAnsi="Times New Roman" w:cs="Times New Roman"/>
+                <w:sz w:val="22"/>
+                <w:szCs w:val="22"/>
+                <w:lang w:val="en-IN"/>
+              </w:rPr>
+              <w:t>ONE_BHK, TWO_BHK, THREE_BHK, FOUR_BHK_PLUS</w:t>
+            </w:r>
+          </w:p>
+        </w:tc>
+      </w:tr>
+      <w:tr>
+        <w:trPr>
+          <w:cnfStyle w:val="000000100000" w:firstRow="0" w:lastRow="0" w:firstColumn="0" w:lastColumn="0" w:oddVBand="0" w:evenVBand="0" w:oddHBand="1" w:evenHBand="0" w:firstRowFirstColumn="0" w:firstRowLastColumn="0" w:lastRowFirstColumn="0" w:lastRowLastColumn="0"/>
+          <w:trHeight w:val="421"/>
+        </w:trPr>
+        <w:tc>
+          <w:tcPr>
+            <w:cnfStyle w:val="001000000000" w:firstRow="0" w:lastRow="0" w:firstColumn="1" w:lastColumn="0" w:oddVBand="0" w:evenVBand="0" w:oddHBand="0" w:evenHBand="0" w:firstRowFirstColumn="0" w:firstRowLastColumn="0" w:lastRowFirstColumn="0" w:lastRowLastColumn="0"/>
+            <w:tcW w:w="0" w:type="auto"/>
+            <w:hideMark/>
+          </w:tcPr>
+          <w:p>
+            <w:pPr>
+              <w:spacing w:after="160" w:line="259" w:lineRule="auto"/>
+              <w:rPr>
+                <w:rFonts w:ascii="Times New Roman" w:hAnsi="Times New Roman" w:cs="Times New Roman"/>
+                <w:sz w:val="22"/>
+                <w:szCs w:val="22"/>
+                <w:lang w:val="en-IN"/>
+              </w:rPr>
+            </w:pPr>
+            <w:proofErr w:type="spellStart"/>
+            <w:r>
+              <w:rPr>
+                <w:rFonts w:ascii="Times New Roman" w:hAnsi="Times New Roman" w:cs="Times New Roman"/>
+                <w:sz w:val="22"/>
+                <w:szCs w:val="22"/>
+                <w:lang w:val="en-IN"/>
+              </w:rPr>
+              <w:t>FurnishingType</w:t>
+            </w:r>
+            <w:proofErr w:type="spellEnd"/>
+          </w:p>
+        </w:tc>
+        <w:tc>
+          <w:tcPr>
+            <w:tcW w:w="0" w:type="auto"/>
+            <w:hideMark/>
+          </w:tcPr>
+          <w:p>
+            <w:pPr>
+              <w:spacing w:after="160" w:line="259" w:lineRule="auto"/>
+              <w:cnfStyle w:val="000000100000" w:firstRow="0" w:lastRow="0" w:firstColumn="0" w:lastColumn="0" w:oddVBand="0" w:evenVBand="0" w:oddHBand="1" w:evenHBand="0" w:firstRowFirstColumn="0" w:firstRowLastColumn="0" w:lastRowFirstColumn="0" w:lastRowLastColumn="0"/>
+              <w:rPr>
+                <w:rFonts w:ascii="Times New Roman" w:hAnsi="Times New Roman" w:cs="Times New Roman"/>
+                <w:sz w:val="22"/>
+                <w:szCs w:val="22"/>
+                <w:lang w:val="en-IN"/>
+              </w:rPr>
+            </w:pPr>
+            <w:r>
+              <w:rPr>
+                <w:rFonts w:ascii="Times New Roman" w:hAnsi="Times New Roman" w:cs="Times New Roman"/>
+                <w:sz w:val="22"/>
+                <w:szCs w:val="22"/>
+                <w:lang w:val="en-IN"/>
+              </w:rPr>
+              <w:t>UNFURNISHED, SEMI_FURNISHED, FULLY_FURNISHED</w:t>
+            </w:r>
+          </w:p>
+        </w:tc>
+      </w:tr>
+      <w:tr>
+        <w:trPr>
+          <w:trHeight w:val="421"/>
+        </w:trPr>
+        <w:tc>
+          <w:tcPr>
+            <w:cnfStyle w:val="001000000000" w:firstRow="0" w:lastRow="0" w:firstColumn="1" w:lastColumn="0" w:oddVBand="0" w:evenVBand="0" w:oddHBand="0" w:evenHBand="0" w:firstRowFirstColumn="0" w:firstRowLastColumn="0" w:lastRowFirstColumn="0" w:lastRowLastColumn="0"/>
+            <w:tcW w:w="0" w:type="auto"/>
+            <w:hideMark/>
+          </w:tcPr>
+          <w:p>
+            <w:pPr>
+              <w:spacing w:after="160" w:line="259" w:lineRule="auto"/>
+              <w:rPr>
+                <w:rFonts w:ascii="Times New Roman" w:hAnsi="Times New Roman" w:cs="Times New Roman"/>
+                <w:sz w:val="22"/>
+                <w:szCs w:val="22"/>
+                <w:lang w:val="en-IN"/>
+              </w:rPr>
+            </w:pPr>
+            <w:proofErr w:type="spellStart"/>
+            <w:r>
+              <w:rPr>
+                <w:rFonts w:ascii="Times New Roman" w:hAnsi="Times New Roman" w:cs="Times New Roman"/>
+                <w:sz w:val="22"/>
+                <w:szCs w:val="22"/>
+                <w:lang w:val="en-IN"/>
+              </w:rPr>
+              <w:t>TenantType</w:t>
+            </w:r>
+            <w:proofErr w:type="spellEnd"/>
+          </w:p>
+        </w:tc>
+        <w:tc>
+          <w:tcPr>
+            <w:tcW w:w="0" w:type="auto"/>
+            <w:hideMark/>
+          </w:tcPr>
+          <w:p>
+            <w:pPr>
+              <w:spacing w:after="160" w:line="259" w:lineRule="auto"/>
+              <w:cnfStyle w:val="000000000000" w:firstRow="0" w:lastRow="0" w:firstColumn="0" w:lastColumn="0" w:oddVBand="0" w:evenVBand="0" w:oddHBand="0" w:evenHBand="0" w:firstRowFirstColumn="0" w:firstRowLastColumn="0" w:lastRowFirstColumn="0" w:lastRowLastColumn="0"/>
+              <w:rPr>
+                <w:rFonts w:ascii="Times New Roman" w:hAnsi="Times New Roman" w:cs="Times New Roman"/>
+                <w:sz w:val="22"/>
+                <w:szCs w:val="22"/>
+                <w:lang w:val="en-IN"/>
+              </w:rPr>
+            </w:pPr>
+            <w:r>
+              <w:rPr>
+                <w:rFonts w:ascii="Times New Roman" w:hAnsi="Times New Roman" w:cs="Times New Roman"/>
+                <w:sz w:val="22"/>
+                <w:szCs w:val="22"/>
+                <w:lang w:val="en-IN"/>
+              </w:rPr>
+              <w:t>FAMILY, BACHELORS, BOTH</w:t>
+            </w:r>
+          </w:p>
+        </w:tc>
+      </w:tr>
+      <w:tr>
+        <w:trPr>
+          <w:cnfStyle w:val="000000100000" w:firstRow="0" w:lastRow="0" w:firstColumn="0" w:lastColumn="0" w:oddVBand="0" w:evenVBand="0" w:oddHBand="1" w:evenHBand="0" w:firstRowFirstColumn="0" w:firstRowLastColumn="0" w:lastRowFirstColumn="0" w:lastRowLastColumn="0"/>
+          <w:trHeight w:val="421"/>
+        </w:trPr>
+        <w:tc>
+          <w:tcPr>
+            <w:cnfStyle w:val="001000000000" w:firstRow="0" w:lastRow="0" w:firstColumn="1" w:lastColumn="0" w:oddVBand="0" w:evenVBand="0" w:oddHBand="0" w:evenHBand="0" w:firstRowFirstColumn="0" w:firstRowLastColumn="0" w:lastRowFirstColumn="0" w:lastRowLastColumn="0"/>
+            <w:tcW w:w="0" w:type="auto"/>
+            <w:hideMark/>
+          </w:tcPr>
+          <w:p>
+            <w:pPr>
+              <w:spacing w:after="160" w:line="259" w:lineRule="auto"/>
+              <w:rPr>
+                <w:rFonts w:ascii="Times New Roman" w:hAnsi="Times New Roman" w:cs="Times New Roman"/>
+                <w:sz w:val="22"/>
+                <w:szCs w:val="22"/>
+                <w:lang w:val="en-IN"/>
+              </w:rPr>
+            </w:pPr>
+            <w:proofErr w:type="spellStart"/>
+            <w:r>
+              <w:rPr>
+                <w:rFonts w:ascii="Times New Roman" w:hAnsi="Times New Roman" w:cs="Times New Roman"/>
+                <w:sz w:val="22"/>
+                <w:szCs w:val="22"/>
+                <w:lang w:val="en-IN"/>
+              </w:rPr>
+              <w:t>VisitStatus</w:t>
+            </w:r>
+            <w:proofErr w:type="spellEnd"/>
+          </w:p>
+        </w:tc>
+        <w:tc>
+          <w:tcPr>
+            <w:tcW w:w="0" w:type="auto"/>
+            <w:hideMark/>
+          </w:tcPr>
+          <w:p>
+            <w:pPr>
+              <w:spacing w:after="160" w:line="259" w:lineRule="auto"/>
+              <w:cnfStyle w:val="000000100000" w:firstRow="0" w:lastRow="0" w:firstColumn="0" w:lastColumn="0" w:oddVBand="0" w:evenVBand="0" w:oddHBand="1" w:evenHBand="0" w:firstRowFirstColumn="0" w:firstRowLastColumn="0" w:lastRowFirstColumn="0" w:lastRowLastColumn="0"/>
+              <w:rPr>
+                <w:rFonts w:ascii="Times New Roman" w:hAnsi="Times New Roman" w:cs="Times New Roman"/>
+                <w:sz w:val="22"/>
+                <w:szCs w:val="22"/>
+                <w:lang w:val="en-IN"/>
+              </w:rPr>
+            </w:pPr>
+            <w:r>
+              <w:rPr>
+                <w:rFonts w:ascii="Times New Roman" w:hAnsi="Times New Roman" w:cs="Times New Roman"/>
+                <w:sz w:val="22"/>
+                <w:szCs w:val="22"/>
+                <w:lang w:val="en-IN"/>
+              </w:rPr>
+              <w:t>PENDING, CONFIRMED, CANCELLED, COMPLETED</w:t>
+            </w:r>
+          </w:p>
+        </w:tc>
+      </w:tr>
+      <w:tr>
+        <w:trPr>
+          <w:trHeight w:val="421"/>
+        </w:trPr>
+        <w:tc>
+          <w:tcPr>
+            <w:cnfStyle w:val="001000000000" w:firstRow="0" w:lastRow="0" w:firstColumn="1" w:lastColumn="0" w:oddVBand="0" w:evenVBand="0" w:oddHBand="0" w:evenHBand="0" w:firstRowFirstColumn="0" w:firstRowLastColumn="0" w:lastRowFirstColumn="0" w:lastRowLastColumn="0"/>
+            <w:tcW w:w="0" w:type="auto"/>
+            <w:hideMark/>
+          </w:tcPr>
+          <w:p>
+            <w:pPr>
+              <w:spacing w:after="160" w:line="259" w:lineRule="auto"/>
+              <w:rPr>
+                <w:rFonts w:ascii="Times New Roman" w:hAnsi="Times New Roman" w:cs="Times New Roman"/>
+                <w:sz w:val="22"/>
+                <w:szCs w:val="22"/>
+                <w:lang w:val="en-IN"/>
+              </w:rPr>
+            </w:pPr>
+            <w:proofErr w:type="spellStart"/>
+            <w:r>
+              <w:rPr>
+                <w:rFonts w:ascii="Times New Roman" w:hAnsi="Times New Roman" w:cs="Times New Roman"/>
+                <w:sz w:val="22"/>
+                <w:szCs w:val="22"/>
+                <w:lang w:val="en-IN"/>
+              </w:rPr>
+              <w:t>ContactMethod</w:t>
+            </w:r>
+            <w:proofErr w:type="spellEnd"/>
+          </w:p>
+        </w:tc>
+        <w:tc>
+          <w:tcPr>
+            <w:tcW w:w="0" w:type="auto"/>
+            <w:hideMark/>
+          </w:tcPr>
+          <w:p>
+            <w:pPr>
+              <w:spacing w:after="160" w:line="259" w:lineRule="auto"/>
+              <w:cnfStyle w:val="000000000000" w:firstRow="0" w:lastRow="0" w:firstColumn="0" w:lastColumn="0" w:oddVBand="0" w:evenVBand="0" w:oddHBand="0" w:evenHBand="0" w:firstRowFirstColumn="0" w:firstRowLastColumn="0" w:lastRowFirstColumn="0" w:lastRowLastColumn="0"/>
+              <w:rPr>
+                <w:rFonts w:ascii="Times New Roman" w:hAnsi="Times New Roman" w:cs="Times New Roman"/>
+                <w:sz w:val="22"/>
+                <w:szCs w:val="22"/>
+                <w:lang w:val="en-IN"/>
+              </w:rPr>
+            </w:pPr>
+            <w:r>
+              <w:rPr>
+                <w:rFonts w:ascii="Times New Roman" w:hAnsi="Times New Roman" w:cs="Times New Roman"/>
+                <w:sz w:val="22"/>
+                <w:szCs w:val="22"/>
+                <w:lang w:val="en-IN"/>
+              </w:rPr>
+              <w:t>WHATSAPP, PHONE, EMAIL</w:t>
+            </w:r>
+          </w:p>
+        </w:tc>
+      </w:tr>
+      <w:tr>
+        <w:trPr>
+          <w:cnfStyle w:val="000000100000" w:firstRow="0" w:lastRow="0" w:firstColumn="0" w:lastColumn="0" w:oddVBand="0" w:evenVBand="0" w:oddHBand="1" w:evenHBand="0" w:firstRowFirstColumn="0" w:firstRowLastColumn="0" w:lastRowFirstColumn="0" w:lastRowLastColumn="0"/>
+          <w:trHeight w:val="421"/>
+        </w:trPr>
+        <w:tc>
+          <w:tcPr>
+            <w:cnfStyle w:val="001000000000" w:firstRow="0" w:lastRow="0" w:firstColumn="1" w:lastColumn="0" w:oddVBand="0" w:evenVBand="0" w:oddHBand="0" w:evenHBand="0" w:firstRowFirstColumn="0" w:firstRowLastColumn="0" w:lastRowFirstColumn="0" w:lastRowLastColumn="0"/>
+            <w:tcW w:w="0" w:type="auto"/>
+            <w:hideMark/>
+          </w:tcPr>
+          <w:p>
+            <w:pPr>
+              <w:spacing w:after="160" w:line="259" w:lineRule="auto"/>
+              <w:rPr>
+                <w:rFonts w:ascii="Times New Roman" w:hAnsi="Times New Roman" w:cs="Times New Roman"/>
+                <w:sz w:val="22"/>
+                <w:szCs w:val="22"/>
+                <w:lang w:val="en-IN"/>
+              </w:rPr>
+            </w:pPr>
+            <w:proofErr w:type="spellStart"/>
+            <w:r>
+              <w:rPr>
+                <w:rFonts w:ascii="Times New Roman" w:hAnsi="Times New Roman" w:cs="Times New Roman"/>
+                <w:sz w:val="22"/>
+                <w:szCs w:val="22"/>
+                <w:lang w:val="en-IN"/>
+              </w:rPr>
+              <w:t>LeadStatus</w:t>
+            </w:r>
+            <w:proofErr w:type="spellEnd"/>
+          </w:p>
+        </w:tc>
+        <w:tc>
+          <w:tcPr>
+            <w:tcW w:w="0" w:type="auto"/>
+            <w:hideMark/>
+          </w:tcPr>
+          <w:p>
+            <w:pPr>
+              <w:spacing w:after="160" w:line="259" w:lineRule="auto"/>
+              <w:cnfStyle w:val="000000100000" w:firstRow="0" w:lastRow="0" w:firstColumn="0" w:lastColumn="0" w:oddVBand="0" w:evenVBand="0" w:oddHBand="1" w:evenHBand="0" w:firstRowFirstColumn="0" w:firstRowLastColumn="0" w:lastRowFirstColumn="0" w:lastRowLastColumn="0"/>
+              <w:rPr>
+                <w:rFonts w:ascii="Times New Roman" w:hAnsi="Times New Roman" w:cs="Times New Roman"/>
+                <w:sz w:val="22"/>
+                <w:szCs w:val="22"/>
+                <w:lang w:val="en-IN"/>
+              </w:rPr>
+            </w:pPr>
+            <w:r>
+              <w:rPr>
+                <w:rFonts w:ascii="Times New Roman" w:hAnsi="Times New Roman" w:cs="Times New Roman"/>
+                <w:sz w:val="22"/>
+                <w:szCs w:val="22"/>
+                <w:lang w:val="en-IN"/>
+              </w:rPr>
+              <w:t>NEW, CONTACTED, CONVERTED, CLOSED</w:t>
+            </w:r>
+          </w:p>
+        </w:tc>
+      </w:tr>
+    </w:tbl>
+    <w:p>
+      <w:pPr>
+        <w:spacing w:after="160" w:line="259" w:lineRule="auto"/>
+        <w:rPr>
+          <w:color w:val="0F9ED5" w:themeColor="accent4"/>
+          <w:lang w:val="en-IN"/>
+        </w:rPr>
+      </w:pPr>
+      <w:r>
+        <w:rPr>
+          <w:b/>
+          <w:bCs/>
+          <w:color w:val="0F9ED5" w:themeColor="accent4"/>
+          <w:lang w:val="en-IN"/>
+        </w:rPr>
+        <w:t>File Reference:</w:t>
+      </w:r>
+      <w:r>
+        <w:rPr>
+          <w:color w:val="0F9ED5" w:themeColor="accent4"/>
+          <w:lang w:val="en-IN"/>
+        </w:rPr>
+        <w:t> /</w:t>
+      </w:r>
+      <w:proofErr w:type="spellStart"/>
+      <w:r>
+        <w:rPr>
+          <w:color w:val="0F9ED5" w:themeColor="accent4"/>
+          <w:lang w:val="en-IN"/>
+        </w:rPr>
+        <w:t>prisma</w:t>
+      </w:r>
+      <w:proofErr w:type="spellEnd"/>
+      <w:r>
+        <w:rPr>
+          <w:color w:val="0F9ED5" w:themeColor="accent4"/>
+          <w:lang w:val="en-IN"/>
+        </w:rPr>
+        <w:t>/</w:t>
+      </w:r>
+      <w:proofErr w:type="spellStart"/>
+      <w:r>
+        <w:rPr>
+          <w:color w:val="0F9ED5" w:themeColor="accent4"/>
+          <w:lang w:val="en-IN"/>
+        </w:rPr>
+        <w:t>schema.prisma</w:t>
+      </w:r>
+      <w:proofErr w:type="spellEnd"/>
+    </w:p>
+    <w:p>
+      <w:pPr>
+        <w:spacing w:after="160" w:line="259" w:lineRule="auto"/>
+      </w:pPr>
+      <w:r>
+        <w:br w:type="page"/>
+      </w:r>
+    </w:p>
+    <w:p>
+      <w:pPr>
+        <w:rPr>
+          <w:lang w:val="en-IN"/>
+        </w:rPr>
+      </w:pPr>
+    </w:p>
     <w:sectPr>
       <w:pgSz w:w="11906" w:h="16838"/>
       <w:pgMar w:top="720" w:right="720" w:bottom="720" w:left="720" w:header="708" w:footer="708" w:gutter="0"/>
@@ -5950,6 +7643,105 @@
       <w:spacing w:val="5"/>
     </w:rPr>
   </w:style>
+  <w:style w:type="table" w:styleId="PlainTable2">
+    <w:name w:val="Plain Table 2"/>
+    <w:basedOn w:val="TableNormal"/>
+    <w:uiPriority w:val="42"/>
+    <w:rsid w:val="005A3D5E"/>
+    <w:pPr>
+      <w:spacing w:after="0" w:line="240" w:lineRule="auto"/>
+    </w:pPr>
+    <w:tblPr>
+      <w:tblStyleRowBandSize w:val="1"/>
+      <w:tblStyleColBandSize w:val="1"/>
+      <w:tblBorders>
+        <w:top w:val="single" w:sz="4" w:space="0" w:color="7F7F7F" w:themeColor="text1" w:themeTint="80"/>
+        <w:bottom w:val="single" w:sz="4" w:space="0" w:color="7F7F7F" w:themeColor="text1" w:themeTint="80"/>
+      </w:tblBorders>
+    </w:tblPr>
+    <w:tblStylePr w:type="firstRow">
+      <w:rPr>
+        <w:b/>
+        <w:bCs/>
+      </w:rPr>
+      <w:tblPr/>
+      <w:tcPr>
+        <w:tcBorders>
+          <w:bottom w:val="single" w:sz="4" w:space="0" w:color="7F7F7F" w:themeColor="text1" w:themeTint="80"/>
+        </w:tcBorders>
+      </w:tcPr>
+    </w:tblStylePr>
+    <w:tblStylePr w:type="lastRow">
+      <w:rPr>
+        <w:b/>
+        <w:bCs/>
+      </w:rPr>
+      <w:tblPr/>
+      <w:tcPr>
+        <w:tcBorders>
+          <w:top w:val="single" w:sz="4" w:space="0" w:color="7F7F7F" w:themeColor="text1" w:themeTint="80"/>
+        </w:tcBorders>
+      </w:tcPr>
+    </w:tblStylePr>
+    <w:tblStylePr w:type="firstCol">
+      <w:rPr>
+        <w:b/>
+        <w:bCs/>
+      </w:rPr>
+    </w:tblStylePr>
+    <w:tblStylePr w:type="lastCol">
+      <w:rPr>
+        <w:b/>
+        <w:bCs/>
+      </w:rPr>
+    </w:tblStylePr>
+    <w:tblStylePr w:type="band1Vert">
+      <w:tblPr/>
+      <w:tcPr>
+        <w:tcBorders>
+          <w:left w:val="single" w:sz="4" w:space="0" w:color="7F7F7F" w:themeColor="text1" w:themeTint="80"/>
+          <w:right w:val="single" w:sz="4" w:space="0" w:color="7F7F7F" w:themeColor="text1" w:themeTint="80"/>
+        </w:tcBorders>
+      </w:tcPr>
+    </w:tblStylePr>
+    <w:tblStylePr w:type="band2Vert">
+      <w:tblPr/>
+      <w:tcPr>
+        <w:tcBorders>
+          <w:left w:val="single" w:sz="4" w:space="0" w:color="7F7F7F" w:themeColor="text1" w:themeTint="80"/>
+          <w:right w:val="single" w:sz="4" w:space="0" w:color="7F7F7F" w:themeColor="text1" w:themeTint="80"/>
+        </w:tcBorders>
+      </w:tcPr>
+    </w:tblStylePr>
+    <w:tblStylePr w:type="band1Horz">
+      <w:tblPr/>
+      <w:tcPr>
+        <w:tcBorders>
+          <w:top w:val="single" w:sz="4" w:space="0" w:color="7F7F7F" w:themeColor="text1" w:themeTint="80"/>
+          <w:bottom w:val="single" w:sz="4" w:space="0" w:color="7F7F7F" w:themeColor="text1" w:themeTint="80"/>
+        </w:tcBorders>
+      </w:tcPr>
+    </w:tblStylePr>
+  </w:style>
+  <w:style w:type="table" w:styleId="TableGrid">
+    <w:name w:val="Table Grid"/>
+    <w:basedOn w:val="TableNormal"/>
+    <w:uiPriority w:val="39"/>
+    <w:rsid w:val="005A3D5E"/>
+    <w:pPr>
+      <w:spacing w:after="0" w:line="240" w:lineRule="auto"/>
+    </w:pPr>
+    <w:tblPr>
+      <w:tblBorders>
+        <w:top w:val="single" w:sz="4" w:space="0" w:color="auto"/>
+        <w:left w:val="single" w:sz="4" w:space="0" w:color="auto"/>
+        <w:bottom w:val="single" w:sz="4" w:space="0" w:color="auto"/>
+        <w:right w:val="single" w:sz="4" w:space="0" w:color="auto"/>
+        <w:insideH w:val="single" w:sz="4" w:space="0" w:color="auto"/>
+        <w:insideV w:val="single" w:sz="4" w:space="0" w:color="auto"/>
+      </w:tblBorders>
+    </w:tblPr>
+  </w:style>
 </w:styles>
 </file>
 

</xml_diff>